<commit_message>
v0.9.1: step 7 answers - deployment window 3m15d, SLA sold separately, negotiated prepayment
Co-Authored-By: Claude Opus 5.5 <noreply@anthropic.com>
Claude-Session: https://claude.ai/code/session_01MBXwez98otRrwCLQwTryr2
</commit_message>
<xml_diff>
--- a/skills/payamgostar-contracts/templates/install-training-support-contract.docx
+++ b/skills/payamgostar-contracts/templates/install-training-support-contract.docx
@@ -3579,7 +3579,7 @@
           <w:rtl/>
           <w:lang w:bidi="fa-IR"/>
         </w:rPr>
-        <w:t xml:space="preserve">1. 60 درصد از هزینه کل قرارداد، بدون احتساب مالیات بر ارزش افزوده، معادل {{پیش‌پرداخت ۶۰٪ کل قرارداد (ریال)}}ريال و به حروف {{پیش‌پرداخت ۶۰٪ به حروف}} ريال  به‌عنوان پیش‌پرداخت و به‌منظور تأیید سفارش، در ابتدای قرارداد توسط کارفرما پرداخت می‌گردد.</w:t>
+        <w:t xml:space="preserve">1. {{درصد پیش‌پرداخت}} درصد از هزینه کل قرارداد، بدون احتساب مالیات بر ارزش افزوده، معادل {{پیش‌پرداخت کل قرارداد (ریال)}}ريال و به حروف {{پیش‌پرداخت به حروف}} ريال  به‌عنوان پیش‌پرداخت و به‌منظور تأیید سفارش، در ابتدای قرارداد توسط کارفرما پرداخت می‌گردد.</w:t>
       </w:r>
       <w:r>
         <w:rPr>
@@ -3664,7 +3664,7 @@
           <w:rtl/>
           <w:lang w:bidi="fa-IR"/>
         </w:rPr>
-        <w:t xml:space="preserve">2. مبلغ باقی‌مانده، معادل 40 درصد از هزینه کل قرارداد، به ارزش {{باقی‌مانده ۴۰٪ (ریال)}}ريال به حروف {{باقی‌مانده ۴۰٪ به حروف}} ريال، به همراه مالیات بر ارزش افزوده متعلقه به ارزش {{مالیات بر ارزش افزوده کل قرارداد (ریال)}}ريال به حروف {{ارزش افزوده به حروف}} ريال، می‌بایست قبل از زمان استقرار نرم‌افزار به مجری پرداخت می‌گردد.</w:t>
+        <w:t xml:space="preserve">2. مبلغ باقی‌مانده، معادل {{درصد باقی‌مانده}} درصد از هزینه کل قرارداد، به ارزش {{باقی‌مانده (ریال)}}ريال به حروف {{باقی‌مانده به حروف}} ريال، به همراه مالیات بر ارزش افزوده متعلقه به ارزش {{مالیات بر ارزش افزوده کل قرارداد (ریال)}}ريال به حروف {{ارزش افزوده به حروف}} ريال، می‌بایست قبل از زمان استقرار نرم‌افزار به مجری پرداخت می‌گردد.</w:t>
       </w:r>
       <w:r>
         <w:rPr>

</xml_diff>